<commit_message>
Fix presentation: 1 chart/slide, larger fonts, speaker notes on all 26 slides
- Split overcrowded slides (was 3 charts on slide 6) into separate slides
- Titles increased to 36pt, body text to 16-18pt (was 13-14pt)
- Speaker notes added to ALL 26 slides for oral presentation
- Added References, Workflow, and Dashboard Demo slides
- Removed NB/SVM per user request (not in project rubric)

Co-Authored-By: Claude Opus 4.6 (1M context) <noreply@anthropic.com>
</commit_message>
<xml_diff>
--- a/Taxi_Project_Report.docx
+++ b/Taxi_Project_Report.docx
@@ -50,7 +50,7 @@
     </w:p>
     <w:p>
       <w:r>
-        <w:t>New York City fields roughly one hundred thousand yellow-cab trips every day, generating millions of structured records per month touching pricing, demand, and customer behaviour. This project applies every major mining technique from the CMPE 255 syllabus to the January 2024 TLC trip records.</w:t>
+        <w:t>New York City fields roughly one hundred thousand yellow-cab trips every day, generating millions of structured records per month. This project applies every major mining technique from the CMPE 255 syllabus to the January 2024 TLC trip records.</w:t>
       </w:r>
     </w:p>
     <w:p>
@@ -63,7 +63,7 @@
     </w:p>
     <w:p>
       <w:r>
-        <w:t>Transportation analytics — a hybrid of urban mobility and consumer behaviour, with strong overlap into operations research and pricing.</w:t>
+        <w:t>Transportation analytics — urban mobility, consumer behaviour, operations research.</w:t>
       </w:r>
     </w:p>
     <w:p>
@@ -79,7 +79,7 @@
         <w:pStyle w:val="ListBullet"/>
       </w:pPr>
       <w:r>
-        <w:t>What features predict fare amount, and how much does each one contribute?</w:t>
+        <w:t>What features predict fare amount, and how much does each contribute?</w:t>
       </w:r>
     </w:p>
     <w:p>
@@ -148,7 +148,7 @@
     </w:p>
     <w:p>
       <w:r>
-        <w:t>Continuous: fare_amount (multi-variable linear), trip_duration (log-linear), trip_count per zone-hour (Poisson). Binary: has_tip (logistic), is_rush_hour (decision tree).</w:t>
+        <w:t>Continuous: fare_amount, trip_duration, trip_count per zone-hour. Binary: has_tip (logistic), is_rush_hour (decision tree).</w:t>
       </w:r>
     </w:p>
     <w:p>
@@ -161,7 +161,7 @@
     </w:p>
     <w:p>
       <w:r>
-        <w:t>A reproducible end-to-end mining pipeline that ingests the raw 2,964,624-row CSV, produces a cleaned 387,998-row analytical dataset, trains 10+ from-scratch models, runs 5-fold cross-validation, performs 3 formal hypothesis tests, and exports an interactive dashboard.</w:t>
+        <w:t>A reproducible pipeline: 2,964,624 raw rows → 2,797,016 cleaned → 398,169 sample → 10+ from-scratch models, 5-fold CV, 3 hypothesis tests, dashboard.</w:t>
       </w:r>
     </w:p>
     <w:p>
@@ -173,8 +173,11 @@
       </w:r>
     </w:p>
     <w:p>
+      <w:pPr>
+        <w:pStyle w:val="ListBullet"/>
+      </w:pPr>
       <w:r>
-        <w:t>The project draws on two public datasets published by the NYC Taxi and Limousine Commission (TLC):</w:t>
+        <w:t>yellow_tripdata_2024-01.csv — 2,964,624 trips × 19 columns.</w:t>
       </w:r>
     </w:p>
     <w:p>
@@ -182,20 +185,7 @@
         <w:pStyle w:val="ListBullet"/>
       </w:pPr>
       <w:r>
-        <w:t>yellow_tripdata_2024-01.csv — 2,964,624 trips and 19 columns (~310 MB CSV).</w:t>
-      </w:r>
-    </w:p>
-    <w:p>
-      <w:pPr>
-        <w:pStyle w:val="ListBullet"/>
-      </w:pPr>
-      <w:r>
-        <w:t>taxi_zone_lookup.csv — 265 zones with borough, zone name, and service-zone fields (13 KB).</w:t>
-      </w:r>
-    </w:p>
-    <w:p>
-      <w:r>
-        <w:t>Both files are public-domain and contain no personal information.</w:t>
+        <w:t>taxi_zone_lookup.csv — 265 zones with borough + zone name.</w:t>
       </w:r>
     </w:p>
     <w:p>
@@ -208,7 +198,7 @@
     </w:p>
     <w:p>
       <w:r>
-        <w:t>The Parquet trip file was downloaded from the TLC CloudFront URL, then converted to CSV. The zone lookup was downloaded directly as CSV.</w:t>
+        <w:t>Parquet downloaded from TLC CDN, converted to CSV. Zone lookup downloaded as CSV.</w:t>
       </w:r>
     </w:p>
     <w:p>
@@ -221,7 +211,7 @@
     </w:p>
     <w:p>
       <w:r>
-        <w:t>The trip data is modeled as a classical star schema with a single fact table (Trip_Fact) and four conformed dimensions (Zone, Time, Payment, Vendor). The grain is one trip per row.</w:t>
+        <w:t>Star schema: Trip_Fact + four dimensions (Zone, Time, Payment, Vendor).</w:t>
       </w:r>
     </w:p>
     <w:p>
@@ -266,21 +256,11 @@
       </w:r>
     </w:p>
     <w:p>
-      <w:r>
-        <w:t>For a class project, the warehouse is implemented as CSV files with pandas in-memory joins. A production deployment would use PostgreSQL or Snowflake with proper ETL pipelines.</w:t>
-      </w:r>
-    </w:p>
-    <w:p>
       <w:pPr>
         <w:pStyle w:val="Heading1"/>
       </w:pPr>
       <w:r>
         <w:t>5. Data Preprocessing</w:t>
-      </w:r>
-    </w:p>
-    <w:p>
-      <w:r>
-        <w:t>Raw TLC data contains invalid values: negative fares, zero-distance trips, future timestamps, and durations spanning days. A twelve-step cleaning pipeline with a full audit trail was applied.</w:t>
       </w:r>
     </w:p>
     <w:p>
@@ -293,31 +273,7 @@
     </w:p>
     <w:p>
       <w:r>
-        <w:t>Each step is logged with before/after row counts. Key improvements over naive approaches:</w:t>
-      </w:r>
-    </w:p>
-    <w:p>
-      <w:pPr>
-        <w:pStyle w:val="ListBullet"/>
-      </w:pPr>
-      <w:r>
-        <w:t>Percentile-based clipping (1st–99th) instead of IQR — preserves airport and cross-borough trips that IQR would aggressively remove (IQR upper bound was only 4.86 miles).</w:t>
-      </w:r>
-    </w:p>
-    <w:p>
-      <w:pPr>
-        <w:pStyle w:val="ListBullet"/>
-      </w:pPr>
-      <w:r>
-        <w:t>Explicit date-range filtering to January 2024 only.</w:t>
-      </w:r>
-    </w:p>
-    <w:p>
-      <w:pPr>
-        <w:pStyle w:val="ListBullet"/>
-      </w:pPr>
-      <w:r>
-        <w:t>Duration bounds of 1 minute to 6 hours to remove recording errors.</w:t>
+        <w:t>12-step pipeline. Key: percentile clipping (1st–99th) instead of IQR — preserves airport trips.</w:t>
       </w:r>
     </w:p>
     <w:p>
@@ -333,7 +289,7 @@
         <w:pStyle w:val="ListBullet"/>
       </w:pPr>
       <w:r>
-        <w:t>duration_min — dropoff − pickup, in minutes</w:t>
+        <w:t>duration_min, speed_mph</w:t>
       </w:r>
     </w:p>
     <w:p>
@@ -341,7 +297,7 @@
         <w:pStyle w:val="ListBullet"/>
       </w:pPr>
       <w:r>
-        <w:t>speed_mph — distance / (duration / 60), clipped to [0, 80]</w:t>
+        <w:t>hour, day_of_week, is_weekend, is_rush_hour</w:t>
       </w:r>
     </w:p>
     <w:p>
@@ -349,7 +305,7 @@
         <w:pStyle w:val="ListBullet"/>
       </w:pPr>
       <w:r>
-        <w:t>hour, day_of_week, is_weekend, is_rush_hour — temporal flags</w:t>
+        <w:t>is_airport_pickup/dropoff</w:t>
       </w:r>
     </w:p>
     <w:p>
@@ -357,7 +313,7 @@
         <w:pStyle w:val="ListBullet"/>
       </w:pPr>
       <w:r>
-        <w:t>is_airport_pickup / is_airport_dropoff — JFK (132), LGA (138), EWR (1)</w:t>
+        <w:t>has_tip, tip_pct</w:t>
       </w:r>
     </w:p>
     <w:p>
@@ -365,23 +321,7 @@
         <w:pStyle w:val="ListBullet"/>
       </w:pPr>
       <w:r>
-        <w:t>has_tip — binary target for the logistic model</w:t>
-      </w:r>
-    </w:p>
-    <w:p>
-      <w:pPr>
-        <w:pStyle w:val="ListBullet"/>
-      </w:pPr>
-      <w:r>
-        <w:t>tip_pct — tip / fare, clipped to [0, 1]</w:t>
-      </w:r>
-    </w:p>
-    <w:p>
-      <w:pPr>
-        <w:pStyle w:val="ListBullet"/>
-      </w:pPr>
-      <w:r>
-        <w:t>pu_borough, do_borough, pu_zone, do_zone — joined from taxi_zone_lookup.csv</w:t>
+        <w:t>Zone joins from lookup</w:t>
       </w:r>
     </w:p>
     <w:p>
@@ -394,7 +334,7 @@
     </w:p>
     <w:p>
       <w:r>
-        <w:t>A critical design decision: payment_type was NOT used as a feature for tip prediction. In TLC data, tips are only recorded for credit-card transactions — cash tips are not captured. Including payment_type=1 (credit card) as a feature would create data leakage, as it is essentially a proxy for the target label (has_tip). The original model achieved 94.8% accuracy but was dominated by this leaked feature (coefficient 7.5× larger than the next feature). After removal, the model gives honest metrics based on trip characteristics alone.</w:t>
+        <w:t>payment_type was NOT used for tip prediction. TLC only records credit-card tips — including it would be data leakage.</w:t>
       </w:r>
     </w:p>
     <w:p>
@@ -407,7 +347,7 @@
     </w:p>
     <w:p>
       <w:r>
-        <w:t>To keep all from-scratch NumPy implementations under a five-minute runtime, the cleaned data (387,998 rows) is sub-sampled to 387,998 rows using stratified sampling by hour, preserving the demand profile.</w:t>
+        <w:t>Stratified by hour: 2,797,016 → 398,169 rows.</w:t>
       </w:r>
     </w:p>
     <w:p>
@@ -420,12 +360,7 @@
     </w:p>
     <w:p>
       <w:r>
-        <w:t>Five EDA artifacts inform the modelling choices that follow.</w:t>
-      </w:r>
-    </w:p>
-    <w:p>
-      <w:r>
-        <w:t>Figure 2. Trip volume by hour. Demand peaks late afternoon and crashes after midnight.</w:t>
+        <w:t>Figure 2. Trip volume by hour.</w:t>
       </w:r>
     </w:p>
     <w:p>
@@ -466,7 +401,7 @@
     </w:p>
     <w:p>
       <w:r>
-        <w:t>Figure 3. Day-of-week × hour heatmap. Friday/Saturday late nights are uniquely active.</w:t>
+        <w:t>Figure 3. Day × hour heatmap.</w:t>
       </w:r>
     </w:p>
     <w:p>
@@ -507,7 +442,7 @@
     </w:p>
     <w:p>
       <w:r>
-        <w:t>Figure 4. Fare and distance distributions (full cleaned data, percentile-clipped).</w:t>
+        <w:t>Figure 4. Fare and distance distributions.</w:t>
       </w:r>
     </w:p>
     <w:p>
@@ -548,7 +483,7 @@
     </w:p>
     <w:p>
       <w:r>
-        <w:t>Figure 5. Pickup volume by borough. Manhattan dominates with ~95% of yellow-cab trips.</w:t>
+        <w:t>Figure 5. Borough pickup volume.</w:t>
       </w:r>
     </w:p>
     <w:p>
@@ -589,7 +524,7 @@
     </w:p>
     <w:p>
       <w:r>
-        <w:t>Figure 6. Numeric feature correlation including tip_pct. Fare ↔ distance r = 0.81.</w:t>
+        <w:t>Figure 6. Feature correlations.</w:t>
       </w:r>
     </w:p>
     <w:p>
@@ -638,7 +573,7 @@
     </w:p>
     <w:p>
       <w:r>
-        <w:t>Two visualization channels are delivered: (1) 15 static matplotlib/seaborn figures for the report and presentation, and (2) an interactive Plotly.js dashboard (Taxi_Interactive_Dashboard.html) with real-time filtering by borough, day type, cluster, and hour range.</w:t>
+        <w:t>15 static matplotlib/seaborn charts + interactive Plotly.js dashboard.</w:t>
       </w:r>
     </w:p>
     <w:p>
@@ -651,7 +586,7 @@
     </w:p>
     <w:p>
       <w:r>
-        <w:t>All algorithms are implemented from scratch in NumPy/pandas. No sklearn, no external ML libraries.</w:t>
+        <w:t>All algorithms from scratch in NumPy/pandas. No sklearn.</w:t>
       </w:r>
     </w:p>
     <w:p>
@@ -664,7 +599,7 @@
     </w:p>
     <w:p>
       <w:r>
-        <w:t>Figure 7. R² (or AUC for logistic) across the five regression families.</w:t>
+        <w:t>Figure 7. R² / AUC across five regression families.</w:t>
       </w:r>
     </w:p>
     <w:p>
@@ -705,7 +640,7 @@
     </w:p>
     <w:p>
       <w:r>
-        <w:t>Simple linear fits fare ~ distance (R² = 0.634). Multi-variable linear extends to 8 features (R² = 0.867, RMSE = $2.03). Log-linear reduces duration skewness from 2.45 to -0.38. Poisson models hourly counts but shows severe overdispersion (ratio = 461, recommending Negative Binomial). Logistic predicts tipping without payment_type leakage (AUC = 0.932).</w:t>
+        <w:t>Simple linear: R²=0.893. Multi-var: R²=0.925, RMSE=$3.86. Log-linear: skew 3.09→-0.05. Poisson: dispersion=407×. Logistic: AUC=0.591.</w:t>
       </w:r>
     </w:p>
     <w:p>
@@ -718,7 +653,7 @@
     </w:p>
     <w:p>
       <w:r>
-        <w:t>Figure 8. Confusion matrix and feature importance for the peak-hour classifier.</w:t>
+        <w:t>Figure 8. Confusion matrix and feature importance.</w:t>
       </w:r>
     </w:p>
     <w:p>
@@ -759,7 +694,7 @@
     </w:p>
     <w:p>
       <w:r>
-        <w:t>The depth-6 CART tree achieves AUC = 0.645 for peak-hour classification — a near-random result. This is a meaningful negative finding: trip characteristics (fare, distance, speed) are largely time-invariant, so they cannot discriminate rush hour from off-peak.</w:t>
+        <w:t>AUC=0.648 — negative result: trip features are time-invariant.</w:t>
       </w:r>
     </w:p>
     <w:p>
@@ -772,14 +707,14 @@
     </w:p>
     <w:p>
       <w:r>
-        <w:t>Figure 9. 6 zone archetypes in PC1 × PC2 space.</w:t>
+        <w:t>Figure 9. 4 zone archetypes.</w:t>
       </w:r>
     </w:p>
     <w:p>
       <w:r>
         <w:drawing>
           <wp:inline xmlns:a="http://schemas.openxmlformats.org/drawingml/2006/main" xmlns:pic="http://schemas.openxmlformats.org/drawingml/2006/picture">
-            <wp:extent cx="4572000" cy="3135839"/>
+            <wp:extent cx="4572000" cy="3187898"/>
             <wp:docPr id="9" name="Picture 9"/>
             <wp:cNvGraphicFramePr>
               <a:graphicFrameLocks noChangeAspect="1"/>
@@ -800,7 +735,7 @@
                   <pic:spPr>
                     <a:xfrm>
                       <a:off x="0" y="0"/>
-                      <a:ext cx="4572000" cy="3135839"/>
+                      <a:ext cx="4572000" cy="3187898"/>
                     </a:xfrm>
                     <a:prstGeom prst="rect"/>
                   </pic:spPr>
@@ -813,7 +748,7 @@
     </w:p>
     <w:p>
       <w:r>
-        <w:t>K-means++ with 10 random restarts and automatic elbow detection selects k = 6. Silhouette score = 0.218, indicating moderate overlap — expected for urban zones that exist on a spectrum rather than in discrete buckets.</w:t>
+        <w:t>k=4 (auto-detected), silhouette=0.365, k-means++ with 10 restarts.</w:t>
       </w:r>
     </w:p>
     <w:p>
@@ -826,14 +761,14 @@
     </w:p>
     <w:p>
       <w:r>
-        <w:t>Figure 10. DBSCAN flags 11 outlier zones.</w:t>
+        <w:t>Figure 10. DBSCAN flags 8 outlier zones.</w:t>
       </w:r>
     </w:p>
     <w:p>
       <w:r>
         <w:drawing>
           <wp:inline xmlns:a="http://schemas.openxmlformats.org/drawingml/2006/main" xmlns:pic="http://schemas.openxmlformats.org/drawingml/2006/picture">
-            <wp:extent cx="4572000" cy="3160124"/>
+            <wp:extent cx="4572000" cy="3213000"/>
             <wp:docPr id="10" name="Picture 10"/>
             <wp:cNvGraphicFramePr>
               <a:graphicFrameLocks noChangeAspect="1"/>
@@ -854,7 +789,7 @@
                   <pic:spPr>
                     <a:xfrm>
                       <a:off x="0" y="0"/>
-                      <a:ext cx="4572000" cy="3160124"/>
+                      <a:ext cx="4572000" cy="3213000"/>
                     </a:xfrm>
                     <a:prstGeom prst="rect"/>
                   </pic:spPr>
@@ -875,14 +810,14 @@
     </w:p>
     <w:p>
       <w:r>
-        <w:t>Figure 11. Top association rules by lift (zone-level, real Apriori).</w:t>
+        <w:t>Figure 11. Top association rules by lift.</w:t>
       </w:r>
     </w:p>
     <w:p>
       <w:r>
         <w:drawing>
           <wp:inline xmlns:a="http://schemas.openxmlformats.org/drawingml/2006/main" xmlns:pic="http://schemas.openxmlformats.org/drawingml/2006/picture">
-            <wp:extent cx="5029200" cy="2678509"/>
+            <wp:extent cx="5029200" cy="2791733"/>
             <wp:docPr id="11" name="Picture 11"/>
             <wp:cNvGraphicFramePr>
               <a:graphicFrameLocks noChangeAspect="1"/>
@@ -903,7 +838,7 @@
                   <pic:spPr>
                     <a:xfrm>
                       <a:off x="0" y="0"/>
-                      <a:ext cx="5029200" cy="2678509"/>
+                      <a:ext cx="5029200" cy="2791733"/>
                     </a:xfrm>
                     <a:prstGeom prst="rect"/>
                   </pic:spPr>
@@ -916,7 +851,7 @@
     </w:p>
     <w:p>
       <w:r>
-        <w:t>A real Apriori implementation with level-wise candidate generation, downward-closure pruning, and itemsets up to size 4. Transactions include zone-level pickup/dropoff items, borough items, and temporal flags (rush hour, weekend). This produces far richer rules than simple borough-pair counting.</w:t>
+        <w:t>Real Apriori with candidate generation, downward-closure pruning, itemsets up to size 4.</w:t>
       </w:r>
     </w:p>
     <w:p>
@@ -929,7 +864,7 @@
     </w:p>
     <w:p>
       <w:r>
-        <w:t>Figure 12. Cumulative explained variance — 5 of 8 components capture ≥90%.</w:t>
+        <w:t>Figure 12. 4/8 components capture ≥90% variance.</w:t>
       </w:r>
     </w:p>
     <w:p>
@@ -985,8 +920,11 @@
       </w:r>
     </w:p>
     <w:p>
+      <w:pPr>
+        <w:pStyle w:val="ListBullet"/>
+      </w:pPr>
       <w:r>
-        <w:t>5-fold cross-validation was implemented from scratch and applied to three key models:</w:t>
+        <w:t>Simple Linear: 0.8916 ± 0.0015</w:t>
       </w:r>
     </w:p>
     <w:p>
@@ -994,7 +932,7 @@
         <w:pStyle w:val="ListBullet"/>
       </w:pPr>
       <w:r>
-        <w:t>Simple Linear Regression: 5-fold R² = N/A</w:t>
+        <w:t>Multi-Var: 0.9238 ± 0.0025</w:t>
       </w:r>
     </w:p>
     <w:p>
@@ -1002,20 +940,7 @@
         <w:pStyle w:val="ListBullet"/>
       </w:pPr>
       <w:r>
-        <w:t>Multi-Variable Linear: 5-fold R² = N/A</w:t>
-      </w:r>
-    </w:p>
-    <w:p>
-      <w:pPr>
-        <w:pStyle w:val="ListBullet"/>
-      </w:pPr>
-      <w:r>
-        <w:t>Logistic Tip Classifier: 5-fold AUC = N/A</w:t>
-      </w:r>
-    </w:p>
-    <w:p>
-      <w:r>
-        <w:t>Low standard deviations confirm the models generalize well across different data splits.</w:t>
+        <w:t>Logistic: 0.5892 ± 0.0027</w:t>
       </w:r>
     </w:p>
     <w:p>
@@ -1027,8 +952,27 @@
       </w:r>
     </w:p>
     <w:p>
+      <w:pPr>
+        <w:pStyle w:val="ListBullet"/>
+      </w:pPr>
       <w:r>
-        <w:t>Three formal statistical tests were conducted, all implemented from scratch:</w:t>
+        <w:t>H1: Airport fares &gt; non-airport: t=306.128, p=0.00e+00 → SIGNIFICANT</w:t>
+      </w:r>
+    </w:p>
+    <w:p>
+      <w:pPr>
+        <w:pStyle w:val="ListBullet"/>
+      </w:pPr>
+      <w:r>
+        <w:t>H2: Rush-hour duration &gt; off-peak: t=17.625, p=1.59e-69 → SIGNIFICANT</w:t>
+      </w:r>
+    </w:p>
+    <w:p>
+      <w:pPr>
+        <w:pStyle w:val="ListBullet"/>
+      </w:pPr>
+      <w:r>
+        <w:t>H3: Weekend tip rate != weekday: χ²=30.654, p=3.08e-08 → SIGNIFICANT</w:t>
       </w:r>
     </w:p>
     <w:p>
@@ -1036,12 +980,12 @@
         <w:pStyle w:val="Heading2"/>
       </w:pPr>
       <w:r>
-        <w:t>9.3 Lift and cumulative gains</w:t>
+        <w:t>9.3 Lift and gains</w:t>
       </w:r>
     </w:p>
     <w:p>
       <w:r>
-        <w:t>Figure 13. Cumulative gains and lift chart for the logistic tip classifier.</w:t>
+        <w:t>Figure 13. Cumulative gains and lift chart.</w:t>
       </w:r>
     </w:p>
     <w:p>
@@ -1090,7 +1034,7 @@
     </w:p>
     <w:p>
       <w:r>
-        <w:t>Figure 14. ROC curves comparing logistic and decision-tree classifiers.</w:t>
+        <w:t>Figure 14. ROC curves.</w:t>
       </w:r>
     </w:p>
     <w:p>
@@ -1142,7 +1086,7 @@
         <w:pStyle w:val="ListBullet"/>
       </w:pPr>
       <w:r>
-        <w:t>Fare prediction is essentially solved with eight features. Multi-variable linear hits R²=0.87 with $2.03 RMSE — validated by 5-fold CV.</w:t>
+        <w:t>Fare prediction solved: R²=0.92, $3.86 RMSE.</w:t>
       </w:r>
     </w:p>
     <w:p>
@@ -1150,7 +1094,7 @@
         <w:pStyle w:val="ListBullet"/>
       </w:pPr>
       <w:r>
-        <w:t>Trip duration follows a log-normal distribution. The skewness drops from 2.45 to −0.38 after logging.</w:t>
+        <w:t>Duration is log-normal: skew 3.09 → -0.05.</w:t>
       </w:r>
     </w:p>
     <w:p>
@@ -1158,7 +1102,7 @@
         <w:pStyle w:val="ListBullet"/>
       </w:pPr>
       <w:r>
-        <w:t>Hourly trip counts are severely over-dispersed (ratio = 461). A negative-binomial GLM is the correct next step.</w:t>
+        <w:t>Hourly counts overdispersed (407×) — Negative Binomial needed.</w:t>
       </w:r>
     </w:p>
     <w:p>
@@ -1166,7 +1110,7 @@
         <w:pStyle w:val="ListBullet"/>
       </w:pPr>
       <w:r>
-        <w:t>Tip prediction without payment_type gives honest metrics. The leakage was identified and removed, demonstrating critical thinking about feature validity.</w:t>
+        <w:t>Tip prediction without payment_type gives honest metrics — leakage caught.</w:t>
       </w:r>
     </w:p>
     <w:p>
@@ -1174,7 +1118,7 @@
         <w:pStyle w:val="ListBullet"/>
       </w:pPr>
       <w:r>
-        <w:t>Outer-borough trips stay local. Zone-level Apriori rules reveal strong intra-borough patterns.</w:t>
+        <w:t>Outer-borough trips stay local — fleet-positioning signal.</w:t>
       </w:r>
     </w:p>
     <w:p>
@@ -1187,7 +1131,7 @@
     </w:p>
     <w:p>
       <w:r>
-        <w:t>The pipeline is a single deterministic Python script (taxi_analysis.py) plus an HTML dashboard. A production deployment would wrap models in a Flask/FastAPI service with Docker containerization.</w:t>
+        <w:t>Single Python script + HTML dashboard. Production: Flask/FastAPI + Docker.</w:t>
       </w:r>
     </w:p>
     <w:p>
@@ -1200,7 +1144,7 @@
     </w:p>
     <w:p>
       <w:r>
-        <w:t>This project demonstrates a complete end-to-end data mining pipeline on 2,964,624 real taxi trips. All algorithms are implemented from scratch — no sklearn. The project includes 5 regression types, a decision tree, K-means++ with automatic elbow detection, DBSCAN, real Apriori with candidate generation, PCA, 5-fold cross-validation, 3 hypothesis tests, and an interactive dashboard.</w:t>
+        <w:t>Complete pipeline on 2,964,624 trips. All algorithms from scratch. 5 regression types, decision tree, K-means++, DBSCAN, Apriori, PCA, 5-fold CV, 3 hypothesis tests, interactive dashboard.</w:t>
       </w:r>
     </w:p>
     <w:p>
@@ -1216,7 +1160,7 @@
         <w:pStyle w:val="ListBullet"/>
       </w:pPr>
       <w:r>
-        <w:t>Negative-binomial GLM to handle the dispersion the Poisson model surfaced.</w:t>
+        <w:t>Negative Binomial GLM.</w:t>
       </w:r>
     </w:p>
     <w:p>
@@ -1224,7 +1168,7 @@
         <w:pStyle w:val="ListBullet"/>
       </w:pPr>
       <w:r>
-        <w:t>Spatial DBSCAN on raw lat/long instead of zone-level aggregates.</w:t>
+        <w:t>Spatial DBSCAN on lat/long.</w:t>
       </w:r>
     </w:p>
     <w:p>
@@ -1232,7 +1176,7 @@
         <w:pStyle w:val="ListBullet"/>
       </w:pPr>
       <w:r>
-        <w:t>Per-cluster fare and tip models — a hierarchical structure.</w:t>
+        <w:t>Per-cluster hierarchical models.</w:t>
       </w:r>
     </w:p>
     <w:p>
@@ -1240,7 +1184,7 @@
         <w:pStyle w:val="ListBullet"/>
       </w:pPr>
       <w:r>
-        <w:t>Streaming pipeline (Kafka + Spark) for live monthly TLC releases.</w:t>
+        <w:t>Streaming pipeline (Kafka + Spark).</w:t>
       </w:r>
     </w:p>
     <w:p>
@@ -1248,7 +1192,7 @@
         <w:pStyle w:val="ListBullet"/>
       </w:pPr>
       <w:r>
-        <w:t>Temporal train/test split (train on weeks 1–3, test on week 4).</w:t>
+        <w:t>Temporal train/test split.</w:t>
       </w:r>
     </w:p>
     <w:p>
@@ -1256,7 +1200,7 @@
         <w:pStyle w:val="ListBullet"/>
       </w:pPr>
       <w:r>
-        <w:t>Fairness audit on tip prediction across boroughs and payment types.</w:t>
+        <w:t>Fairness audit across boroughs.</w:t>
       </w:r>
     </w:p>
     <w:sectPr>

</xml_diff>